<commit_message>
docs(proposal): revise MS1 proposal after Block 1 lecture
- BAFU Data Platform as historical water source, persistence baseline from 2016-2026
- DVC + GCS for data, MLflow on DagsHub for models, data never in Git
- README: where the data lives; .env.example: MLflow/DagsHub variables
</commit_message>
<xml_diff>
--- a/docs/proposal_hslu_Micioni.docx
+++ b/docs/proposal_hslu_Micioni.docx
@@ -35,7 +35,15 @@
           <w:sz w:val="19"/>
           <w:szCs w:val="21"/>
         </w:rPr>
-        <w:t xml:space="preserve">Student : </w:t>
+        <w:t>Student:</w:t>
+      </w:r>
+      <w:r>
+        <w:rPr>
+          <w:rFonts w:ascii="Arial" w:hAnsi="Arial" w:cs="Arial"/>
+          <w:sz w:val="19"/>
+          <w:szCs w:val="21"/>
+        </w:rPr>
+        <w:t xml:space="preserve"> </w:t>
       </w:r>
       <w:r>
         <w:rPr>
@@ -85,24 +93,50 @@
     <w:p>
       <w:pPr>
         <w:pStyle w:val="StandardWeb"/>
-        <w:rPr>
-          <w:rFonts w:ascii="Arial" w:hAnsi="Arial" w:cs="Arial"/>
-          <w:sz w:val="19"/>
-          <w:szCs w:val="21"/>
-        </w:rPr>
-      </w:pPr>
-      <w:r>
-        <w:rPr>
-          <w:rFonts w:ascii="Arial" w:hAnsi="Arial" w:cs="Arial"/>
-          <w:sz w:val="19"/>
-          <w:szCs w:val="21"/>
-        </w:rPr>
-        <w:t>In short: predict tomorrow’s mean water temperature of Lake Geneva at Geneva (BAFU station 2606), one day ahead, targeting at least 20% lower MAE than persistence (preliminary persistence MAE 0.42 °C; provisional target 0.33 °C).</w:t>
+        <w:jc w:val="both"/>
+        <w:rPr>
+          <w:rFonts w:ascii="Arial" w:hAnsi="Arial" w:cs="Arial"/>
+          <w:sz w:val="19"/>
+          <w:szCs w:val="21"/>
+        </w:rPr>
+      </w:pPr>
+      <w:r>
+        <w:rPr>
+          <w:rFonts w:ascii="Arial" w:hAnsi="Arial" w:cs="Arial"/>
+          <w:sz w:val="19"/>
+          <w:szCs w:val="21"/>
+        </w:rPr>
+        <w:t>Predict tomorrow</w:t>
+      </w:r>
+      <w:r>
+        <w:rPr>
+          <w:rFonts w:ascii="Arial" w:hAnsi="Arial" w:cs="Arial"/>
+          <w:sz w:val="19"/>
+          <w:szCs w:val="21"/>
+        </w:rPr>
+        <w:t xml:space="preserve">’s mean water temperature of Lake Geneva at Geneva (BAFU station 2606), one day ahead, targeting at least 20% lower MAE than persistence </w:t>
+      </w:r>
+      <w:r>
+        <w:rPr>
+          <w:rFonts w:ascii="Arial" w:hAnsi="Arial" w:cs="Arial"/>
+          <w:sz w:val="19"/>
+          <w:szCs w:val="21"/>
+        </w:rPr>
+        <w:t>(persistence MAE 0.24 °C in October–January, so a target of at most 0.19 °C)</w:t>
+      </w:r>
+      <w:r>
+        <w:rPr>
+          <w:rFonts w:ascii="Arial" w:hAnsi="Arial" w:cs="Arial"/>
+          <w:sz w:val="19"/>
+          <w:szCs w:val="21"/>
+        </w:rPr>
+        <w:t>.</w:t>
       </w:r>
     </w:p>
     <w:p>
       <w:pPr>
         <w:pStyle w:val="StandardWeb"/>
+        <w:jc w:val="both"/>
         <w:rPr>
           <w:rFonts w:ascii="Arial" w:hAnsi="Arial" w:cs="Arial"/>
           <w:sz w:val="19"/>
@@ -177,6 +211,7 @@
     <w:p>
       <w:pPr>
         <w:pStyle w:val="StandardWeb"/>
+        <w:jc w:val="both"/>
         <w:rPr>
           <w:rFonts w:ascii="Arial" w:hAnsi="Arial" w:cs="Arial"/>
           <w:sz w:val="19"/>
@@ -203,19 +238,19 @@
     <w:p>
       <w:pPr>
         <w:pStyle w:val="StandardWeb"/>
-        <w:rPr>
-          <w:rFonts w:ascii="Arial" w:hAnsi="Arial" w:cs="Arial"/>
-          <w:sz w:val="19"/>
-          <w:szCs w:val="21"/>
-        </w:rPr>
-      </w:pPr>
-      <w:r>
-        <w:rPr>
-          <w:rFonts w:ascii="Arial" w:hAnsi="Arial" w:cs="Arial"/>
-          <w:sz w:val="19"/>
-          <w:szCs w:val="21"/>
-        </w:rPr>
-        <w:t>Success criterion: model MAE at least 20% lower than persistence on the out-of-time test set; with preliminary persistence MAE 0.42 °C, the provisional target is about 0.33 °C. For a swimmer, an error of a third of a degree is negligible. On the data I have so far (15 pairs of consecutive complete days between 29.08. and 26.09.2026), persistence has an MAE of 0.42 °C, with a worst day of 1.34 °C.</w:t>
+        <w:jc w:val="both"/>
+        <w:rPr>
+          <w:rFonts w:ascii="Arial" w:hAnsi="Arial" w:cs="Arial"/>
+          <w:sz w:val="19"/>
+          <w:szCs w:val="21"/>
+        </w:rPr>
+      </w:pPr>
+      <w:r>
+        <w:rPr>
+          <w:rFonts w:ascii="Arial" w:hAnsi="Arial"/>
+          <w:sz w:val="19"/>
+        </w:rPr>
+        <w:t>Success criterion: model MAE at least 20% lower than persistence on the out-of-time test set. On ten years of BAFU daily means (2016–2026), persistence has an MAE of 0.52 °C over all seasons but only 0.24 °C in October–January, when the lake cools slowly. For my evaluation period the target is therefore an MAE of at most 0.19 °C.</w:t>
       </w:r>
     </w:p>
     <w:p>
@@ -237,6 +272,7 @@
     <w:p>
       <w:pPr>
         <w:pStyle w:val="StandardWeb"/>
+        <w:jc w:val="both"/>
         <w:rPr>
           <w:rFonts w:ascii="Arial" w:hAnsi="Arial" w:cs="Arial"/>
           <w:sz w:val="19"/>
@@ -255,6 +291,7 @@
     <w:p>
       <w:pPr>
         <w:pStyle w:val="StandardWeb"/>
+        <w:jc w:val="both"/>
         <w:rPr>
           <w:rFonts w:ascii="Arial" w:hAnsi="Arial" w:cs="Arial"/>
           <w:sz w:val="19"/>
@@ -337,55 +374,69 @@
     <w:p>
       <w:pPr>
         <w:pStyle w:val="StandardWeb"/>
-        <w:rPr>
-          <w:rFonts w:ascii="Arial" w:hAnsi="Arial" w:cs="Arial"/>
-          <w:sz w:val="19"/>
-          <w:szCs w:val="21"/>
-        </w:rPr>
-      </w:pPr>
-      <w:r>
-        <w:rPr>
-          <w:rFonts w:ascii="Arial" w:hAnsi="Arial" w:cs="Arial"/>
-          <w:sz w:val="19"/>
-          <w:szCs w:val="21"/>
-        </w:rPr>
-        <w:t>The water data comes from the Federal Office for the Environment (FOEN/BAFU) [1]. Station 2606 measures water temperature and discharge every 10 minutes. I access it through the REST API of existenz.ch [2], which republishes the BAFU data and allows free non-commercial use. If that API is down, the fallback is the official BAFU feed on LINDAS [3], which has the same latest values but no history. The weather comes from the Open-Meteo forecast API [4] for Geneva (46.20 N / 6.14 E). For backfill I use Open-Meteo’s Single Runs API [5], selecting the latest archived run available before 18:00 so training uses only information available at inference time.</w:t>
+        <w:jc w:val="both"/>
+        <w:rPr>
+          <w:rFonts w:ascii="Arial" w:hAnsi="Arial" w:cs="Arial"/>
+          <w:sz w:val="19"/>
+          <w:szCs w:val="21"/>
+        </w:rPr>
+      </w:pPr>
+      <w:r>
+        <w:rPr>
+          <w:rFonts w:ascii="Arial" w:hAnsi="Arial"/>
+          <w:sz w:val="19"/>
+        </w:rPr>
+        <w:t xml:space="preserve">The water data comes from the Federal Office for the Environment (FOEN/BAFU) [1]. Station 2606 measures water temperature and discharge every 10 minutes. For live ingestion I use the REST API of existenz.ch [2], with the official LINDAS feed as fallback [3]. For historical water backfill I use the official BAFU Data Platform GraphQL API [1]. The weather comes from the Open-Meteo Forecast API [4] for Geneva (46.20 N / 6.14 E). </w:t>
+      </w:r>
+      <w:r>
+        <w:rPr>
+          <w:rFonts w:ascii="Arial" w:hAnsi="Arial"/>
+          <w:sz w:val="19"/>
+        </w:rPr>
+        <w:t>For backfill and backtesting I use</w:t>
+      </w:r>
+      <w:r>
+        <w:rPr>
+          <w:rFonts w:ascii="Arial" w:hAnsi="Arial"/>
+          <w:sz w:val="19"/>
+        </w:rPr>
+        <w:t xml:space="preserve"> Open-Meteo's Single Runs API [5], selecting a run that was actually available by 18:00, accounting for model publication delay.</w:t>
       </w:r>
     </w:p>
     <w:p>
       <w:pPr>
         <w:pStyle w:val="StandardWeb"/>
-        <w:rPr>
-          <w:rFonts w:ascii="Arial" w:hAnsi="Arial" w:cs="Arial"/>
-          <w:sz w:val="19"/>
-          <w:szCs w:val="21"/>
-        </w:rPr>
-      </w:pPr>
-      <w:r>
-        <w:rPr>
-          <w:rFonts w:ascii="Arial" w:hAnsi="Arial" w:cs="Arial"/>
-          <w:sz w:val="19"/>
-          <w:szCs w:val="21"/>
-        </w:rPr>
-        <w:t>The weak point is the history: existenz.ch only keeps about 32 days. On 29.09.2026 I saved everything that was still available (3,856 readings from 28.08. on; only 20 days are complete because of gaps). So in practice the water history starts when my poller starts. It grows by 144 readings, or one training row, per day, which gives around 90 rows by MS3. The Open-Meteo Single Runs archive covers the current water-history period. Because the data set stays small, I start with a regularised linear model (Ridge).</w:t>
+        <w:jc w:val="both"/>
+        <w:rPr>
+          <w:rFonts w:ascii="Arial" w:hAnsi="Arial" w:cs="Arial"/>
+          <w:sz w:val="19"/>
+          <w:szCs w:val="21"/>
+        </w:rPr>
+      </w:pPr>
+      <w:r>
+        <w:rPr>
+          <w:rFonts w:ascii="Arial" w:hAnsi="Arial"/>
+          <w:sz w:val="19"/>
+        </w:rPr>
+        <w:t>The existenz.ch REST history covers only about 32 days, but the BAFU Data Platform provides station 2606 history back to 2016 (daily, hourly and 10-minute values), so training is not limited to the poller start. Single Runs exist from mid-April 2026, giving about 170 training days today plus one per day; the Previous Runs API (two-day-old forecasts, back to 2022) allows a longer backfill. A daily GitHub Actions job saves new raw CSVs in a GitHub Release (outside Git) until the GCS bucket exists; from MS2 raw and feature data are stored in GCS and tracked with DVC. I start with a regularised linear model (Ridge).</w:t>
       </w:r>
     </w:p>
     <w:p>
       <w:pPr>
         <w:pStyle w:val="StandardWeb"/>
-        <w:rPr>
-          <w:rFonts w:ascii="Arial" w:hAnsi="Arial" w:cs="Arial"/>
-          <w:sz w:val="19"/>
-          <w:szCs w:val="21"/>
-        </w:rPr>
-      </w:pPr>
-      <w:r>
-        <w:rPr>
-          <w:rFonts w:ascii="Arial" w:hAnsi="Arial" w:cs="Arial"/>
-          <w:sz w:val="19"/>
-          <w:szCs w:val="21"/>
-        </w:rPr>
-        <w:t>The label is the mean of the measured temperatures at station 2606 on the next day. It is only used if at least 120 of the 144 readings exist; otherwise the day is skipped. It is a measurement from the future, so it cannot be calculated from the features. There is no rare class because this is a regression, but I will report the error separately for days where the temperature changes by more than 0.8 °C, because those are the days where persistence fails.</w:t>
+        <w:jc w:val="both"/>
+        <w:rPr>
+          <w:rFonts w:ascii="Arial" w:hAnsi="Arial" w:cs="Arial"/>
+          <w:sz w:val="19"/>
+          <w:szCs w:val="21"/>
+        </w:rPr>
+      </w:pPr>
+      <w:r>
+        <w:rPr>
+          <w:rFonts w:ascii="Arial" w:hAnsi="Arial"/>
+          <w:sz w:val="19"/>
+        </w:rPr>
+        <w:t>The label is the mean of the measured temperatures at station 2606 on the next day. It is only used if at least 120 of the 144 readings exist (83.3% completeness), which tolerates short gaps while rejecting substantially incomplete days; I will check this threshold during MS2. It is a measurement from the future, so it cannot be calculated from the features. There is no rare class because this is a regression, but I will report the error separately for days where the temperature changes by more than 0.8 °C, because those are the days where persistence fails.</w:t>
       </w:r>
     </w:p>
     <w:p>
@@ -486,11 +537,10 @@
       </w:pPr>
       <w:r>
         <w:rPr>
-          <w:rFonts w:ascii="Arial" w:eastAsia="Times New Roman" w:hAnsi="Arial" w:cs="Arial"/>
-          <w:sz w:val="19"/>
-          <w:szCs w:val="21"/>
-        </w:rPr>
-        <w:t>water_mean_3d, water_trend_3d: mean of the last 3 days, and the change compared to 3 days ago</w:t>
+          <w:rFonts w:ascii="Arial" w:hAnsi="Arial"/>
+          <w:sz w:val="19"/>
+        </w:rPr>
+        <w:t>water_mean_3d, water_trend_3d: 3-day statistics using only information available by 18:00; mean over the current partial day plus the previous two days, and change versus three days earlier</w:t>
       </w:r>
     </w:p>
     <w:p>
@@ -541,20 +591,20 @@
     <w:p>
       <w:pPr>
         <w:pStyle w:val="StandardWeb"/>
-        <w:rPr>
-          <w:rFonts w:ascii="Arial" w:hAnsi="Arial" w:cs="Arial"/>
-          <w:sz w:val="19"/>
-          <w:szCs w:val="21"/>
-        </w:rPr>
-      </w:pPr>
-      <w:r>
-        <w:rPr>
-          <w:rFonts w:ascii="Arial" w:hAnsi="Arial" w:cs="Arial"/>
-          <w:sz w:val="19"/>
-          <w:szCs w:val="21"/>
+        <w:jc w:val="both"/>
+        <w:rPr>
+          <w:rFonts w:ascii="Arial" w:hAnsi="Arial" w:cs="Arial"/>
+          <w:sz w:val="19"/>
+          <w:szCs w:val="21"/>
+        </w:rPr>
+      </w:pPr>
+      <w:r>
+        <w:rPr>
+          <w:rFonts w:ascii="Arial" w:hAnsi="Arial"/>
+          <w:sz w:val="19"/>
         </w:rPr>
         <w:lastRenderedPageBreak/>
-        <w:t>Leakage: I split by time (train on older days, test on the latest weeks) and never shuffle randomly. The pipeline only uses readings from before 18:00 and weather forecasts that were published before that time. Backfill uses the latest archived model run available before 18:00, preventing future-weather leakage. All daily values are computed in the Europe/Zurich time zone, and training and inference use the same feature code.</w:t>
+        <w:t>Leakage: I split by time and never shuffle randomly. During development I use expanding-window validation; the final evaluation uses the latest period as an out-of-time holdout. Only readings and weather forecasts actually available before 18:00 are used. Backfill respects forecast publication delay. All daily values use Europe/Zurich time, and training and inference use the same weather model and feature code.</w:t>
       </w:r>
     </w:p>
     <w:p>
@@ -591,10 +641,10 @@
           <w:szCs w:val="21"/>
         </w:rPr>
         <w:drawing>
-          <wp:inline distT="0" distB="0" distL="0" distR="0" wp14:anchorId="47874398" wp14:editId="33F651FC">
-            <wp:extent cx="6096000" cy="2824976"/>
-            <wp:effectExtent l="0" t="0" r="0" b="0"/>
-            <wp:docPr id="1947047392" name="Grafik 1"/>
+          <wp:inline distT="0" distB="0" distL="0" distR="0" wp14:anchorId="1AB56D51" wp14:editId="4F27A67A">
+            <wp:extent cx="5334000" cy="2471854"/>
+            <wp:effectExtent l="0" t="0" r="0" b="5080"/>
+            <wp:docPr id="1613730187" name="Grafik 1"/>
             <wp:cNvGraphicFramePr>
               <a:graphicFrameLocks xmlns:a="http://schemas.openxmlformats.org/drawingml/2006/main"/>
             </wp:cNvGraphicFramePr>
@@ -602,7 +652,7 @@
               <a:graphicData uri="http://schemas.openxmlformats.org/drawingml/2006/picture">
                 <pic:pic xmlns:pic="http://schemas.openxmlformats.org/drawingml/2006/picture">
                   <pic:nvPicPr>
-                    <pic:cNvPr id="1947047392" name=""/>
+                    <pic:cNvPr id="1613730187" name=""/>
                     <pic:cNvPicPr/>
                   </pic:nvPicPr>
                   <pic:blipFill>
@@ -620,7 +670,7 @@
                   <pic:spPr>
                     <a:xfrm>
                       <a:off x="0" y="0"/>
-                      <a:ext cx="6096000" cy="2824976"/>
+                      <a:ext cx="5334000" cy="2471854"/>
                     </a:xfrm>
                     <a:prstGeom prst="rect">
                       <a:avLst/>
@@ -645,7 +695,7 @@
         <w:rPr>
           <w:rFonts w:ascii="Arial" w:hAnsi="Arial" w:cs="Arial"/>
         </w:rPr>
-        <w:t>Figure 1: FTI architecture of the project. The numbered boxes are the three pipelines; the dashed box contains optional parts.</w:t>
+        <w:t>Figure 1: FTI architecture; numbered boxes are the three pipelines, the dashed box is optional.</w:t>
       </w:r>
     </w:p>
     <w:tbl>
@@ -688,7 +738,7 @@
                 <w:rFonts w:ascii="Arial" w:eastAsia="Times New Roman" w:hAnsi="Arial" w:cs="Arial"/>
                 <w:b/>
                 <w:bCs/>
-                <w:sz w:val="18"/>
+                <w:sz w:val="17"/>
                 <w:szCs w:val="20"/>
               </w:rPr>
             </w:pPr>
@@ -697,7 +747,7 @@
                 <w:rFonts w:ascii="Arial" w:eastAsia="Times New Roman" w:hAnsi="Arial" w:cs="Arial"/>
                 <w:b/>
                 <w:bCs/>
-                <w:sz w:val="18"/>
+                <w:sz w:val="17"/>
                 <w:szCs w:val="20"/>
               </w:rPr>
               <w:t>Component</w:t>
@@ -727,7 +777,7 @@
                 <w:rFonts w:ascii="Arial" w:eastAsia="Times New Roman" w:hAnsi="Arial" w:cs="Arial"/>
                 <w:b/>
                 <w:bCs/>
-                <w:sz w:val="18"/>
+                <w:sz w:val="17"/>
                 <w:szCs w:val="20"/>
               </w:rPr>
             </w:pPr>
@@ -736,7 +786,7 @@
                 <w:rFonts w:ascii="Arial" w:eastAsia="Times New Roman" w:hAnsi="Arial" w:cs="Arial"/>
                 <w:b/>
                 <w:bCs/>
-                <w:sz w:val="18"/>
+                <w:sz w:val="17"/>
                 <w:szCs w:val="20"/>
               </w:rPr>
               <w:t>Tool</w:t>
@@ -766,7 +816,7 @@
                 <w:rFonts w:ascii="Arial" w:eastAsia="Times New Roman" w:hAnsi="Arial" w:cs="Arial"/>
                 <w:b/>
                 <w:bCs/>
-                <w:sz w:val="18"/>
+                <w:sz w:val="17"/>
                 <w:szCs w:val="20"/>
               </w:rPr>
             </w:pPr>
@@ -775,7 +825,7 @@
                 <w:rFonts w:ascii="Arial" w:eastAsia="Times New Roman" w:hAnsi="Arial" w:cs="Arial"/>
                 <w:b/>
                 <w:bCs/>
-                <w:sz w:val="18"/>
+                <w:sz w:val="17"/>
                 <w:szCs w:val="20"/>
               </w:rPr>
               <w:t>Why</w:t>
@@ -805,14 +855,14 @@
             <w:pPr>
               <w:rPr>
                 <w:rFonts w:ascii="Arial" w:eastAsia="Times New Roman" w:hAnsi="Arial" w:cs="Arial"/>
-                <w:sz w:val="18"/>
+                <w:sz w:val="17"/>
                 <w:szCs w:val="20"/>
               </w:rPr>
             </w:pPr>
             <w:r>
               <w:rPr>
                 <w:rFonts w:ascii="Arial" w:eastAsia="Times New Roman" w:hAnsi="Arial" w:cs="Arial"/>
-                <w:sz w:val="18"/>
+                <w:sz w:val="17"/>
                 <w:szCs w:val="20"/>
               </w:rPr>
               <w:t>Feature store</w:t>
@@ -840,17 +890,17 @@
             <w:pPr>
               <w:rPr>
                 <w:rFonts w:ascii="Arial" w:eastAsia="Times New Roman" w:hAnsi="Arial" w:cs="Arial"/>
-                <w:sz w:val="18"/>
+                <w:sz w:val="17"/>
                 <w:szCs w:val="20"/>
               </w:rPr>
             </w:pPr>
             <w:r>
               <w:rPr>
                 <w:rFonts w:ascii="Arial" w:eastAsia="Times New Roman" w:hAnsi="Arial" w:cs="Arial"/>
-                <w:sz w:val="18"/>
-                <w:szCs w:val="20"/>
-              </w:rPr>
-              <w:t>Versioned Parquet files on Google Cloud Storage</w:t>
+                <w:sz w:val="17"/>
+                <w:szCs w:val="20"/>
+              </w:rPr>
+              <w:t>Parquet files on Google Cloud Storage, versioned with DVC [9]</w:t>
             </w:r>
           </w:p>
         </w:tc>
@@ -875,17 +925,16 @@
             <w:pPr>
               <w:rPr>
                 <w:rFonts w:ascii="Arial" w:eastAsia="Times New Roman" w:hAnsi="Arial" w:cs="Arial"/>
-                <w:sz w:val="18"/>
+                <w:sz w:val="17"/>
                 <w:szCs w:val="20"/>
               </w:rPr>
             </w:pPr>
             <w:r>
               <w:rPr>
-                <w:rFonts w:ascii="Arial" w:eastAsia="Times New Roman" w:hAnsi="Arial" w:cs="Arial"/>
-                <w:sz w:val="18"/>
-                <w:szCs w:val="20"/>
-              </w:rPr>
-              <w:t>One row per day is very little data, so a separate feature store service is not needed. Paid with the GCP student credits.</w:t>
+                <w:rFonts w:ascii="Arial" w:hAnsi="Arial"/>
+                <w:sz w:val="17"/>
+              </w:rPr>
+              <w:t>One row per day is very little data, so no separate feature store service is needed. Parquet snapshots live in GCS and are tracked with DVC; the DVC pointer files are committed to Git. Paid with the GCP student credits.</w:t>
             </w:r>
           </w:p>
         </w:tc>
@@ -912,14 +961,14 @@
             <w:pPr>
               <w:rPr>
                 <w:rFonts w:ascii="Arial" w:eastAsia="Times New Roman" w:hAnsi="Arial" w:cs="Arial"/>
-                <w:sz w:val="18"/>
+                <w:sz w:val="17"/>
                 <w:szCs w:val="20"/>
               </w:rPr>
             </w:pPr>
             <w:r>
               <w:rPr>
                 <w:rFonts w:ascii="Arial" w:eastAsia="Times New Roman" w:hAnsi="Arial" w:cs="Arial"/>
-                <w:sz w:val="18"/>
+                <w:sz w:val="17"/>
                 <w:szCs w:val="20"/>
               </w:rPr>
               <w:t>Orchestration</w:t>
@@ -947,14 +996,14 @@
             <w:pPr>
               <w:rPr>
                 <w:rFonts w:ascii="Arial" w:eastAsia="Times New Roman" w:hAnsi="Arial" w:cs="Arial"/>
-                <w:sz w:val="18"/>
+                <w:sz w:val="17"/>
                 <w:szCs w:val="20"/>
               </w:rPr>
             </w:pPr>
             <w:r>
               <w:rPr>
                 <w:rFonts w:ascii="Arial" w:eastAsia="Times New Roman" w:hAnsi="Arial" w:cs="Arial"/>
-                <w:sz w:val="18"/>
+                <w:sz w:val="17"/>
                 <w:szCs w:val="20"/>
               </w:rPr>
               <w:t>GitHub Actions (cron)</w:t>
@@ -982,14 +1031,14 @@
             <w:pPr>
               <w:rPr>
                 <w:rFonts w:ascii="Arial" w:eastAsia="Times New Roman" w:hAnsi="Arial" w:cs="Arial"/>
-                <w:sz w:val="18"/>
+                <w:sz w:val="17"/>
                 <w:szCs w:val="20"/>
               </w:rPr>
             </w:pPr>
             <w:r>
               <w:rPr>
                 <w:rFonts w:ascii="Arial" w:eastAsia="Times New Roman" w:hAnsi="Arial" w:cs="Arial"/>
-                <w:sz w:val="18"/>
+                <w:sz w:val="17"/>
                 <w:szCs w:val="20"/>
               </w:rPr>
               <w:t>Free and part of the repo. Runs the daily feature and inference jobs and the weekly retraining.</w:t>
@@ -1019,14 +1068,14 @@
             <w:pPr>
               <w:rPr>
                 <w:rFonts w:ascii="Arial" w:eastAsia="Times New Roman" w:hAnsi="Arial" w:cs="Arial"/>
-                <w:sz w:val="18"/>
+                <w:sz w:val="17"/>
                 <w:szCs w:val="20"/>
               </w:rPr>
             </w:pPr>
             <w:r>
               <w:rPr>
                 <w:rFonts w:ascii="Arial" w:eastAsia="Times New Roman" w:hAnsi="Arial" w:cs="Arial"/>
-                <w:sz w:val="18"/>
+                <w:sz w:val="17"/>
                 <w:szCs w:val="20"/>
               </w:rPr>
               <w:t>Experiment tracking and registry</w:t>
@@ -1054,17 +1103,17 @@
             <w:pPr>
               <w:rPr>
                 <w:rFonts w:ascii="Arial" w:eastAsia="Times New Roman" w:hAnsi="Arial" w:cs="Arial"/>
-                <w:sz w:val="18"/>
+                <w:sz w:val="17"/>
                 <w:szCs w:val="20"/>
               </w:rPr>
             </w:pPr>
             <w:r>
               <w:rPr>
                 <w:rFonts w:ascii="Arial" w:eastAsia="Times New Roman" w:hAnsi="Arial" w:cs="Arial"/>
-                <w:sz w:val="18"/>
-                <w:szCs w:val="20"/>
-              </w:rPr>
-              <w:t>Weights &amp; Biases</w:t>
+                <w:sz w:val="17"/>
+                <w:szCs w:val="20"/>
+              </w:rPr>
+              <w:t>MLflow, hosted on DagsHub [10]</w:t>
             </w:r>
           </w:p>
         </w:tc>
@@ -1089,17 +1138,17 @@
             <w:pPr>
               <w:rPr>
                 <w:rFonts w:ascii="Arial" w:eastAsia="Times New Roman" w:hAnsi="Arial" w:cs="Arial"/>
-                <w:sz w:val="18"/>
+                <w:sz w:val="17"/>
                 <w:szCs w:val="20"/>
               </w:rPr>
             </w:pPr>
             <w:r>
               <w:rPr>
                 <w:rFonts w:ascii="Arial" w:eastAsia="Times New Roman" w:hAnsi="Arial" w:cs="Arial"/>
-                <w:sz w:val="18"/>
-                <w:szCs w:val="20"/>
-              </w:rPr>
-              <w:t>Hosted, so I don’t need to run my own tracking server. It has tracking and a model registry.</w:t>
+                <w:sz w:val="17"/>
+                <w:szCs w:val="20"/>
+              </w:rPr>
+              <w:t>Free hosted MLflow for public repos, so I don't run my own server. Logs parameters, metrics and the model; the registry alias champion marks the model that is served.</w:t>
             </w:r>
           </w:p>
         </w:tc>
@@ -1126,14 +1175,14 @@
             <w:pPr>
               <w:rPr>
                 <w:rFonts w:ascii="Arial" w:eastAsia="Times New Roman" w:hAnsi="Arial" w:cs="Arial"/>
-                <w:sz w:val="18"/>
+                <w:sz w:val="17"/>
                 <w:szCs w:val="20"/>
               </w:rPr>
             </w:pPr>
             <w:r>
               <w:rPr>
                 <w:rFonts w:ascii="Arial" w:eastAsia="Times New Roman" w:hAnsi="Arial" w:cs="Arial"/>
-                <w:sz w:val="18"/>
+                <w:sz w:val="17"/>
                 <w:szCs w:val="20"/>
               </w:rPr>
               <w:t>Model</w:t>
@@ -1161,17 +1210,17 @@
             <w:pPr>
               <w:rPr>
                 <w:rFonts w:ascii="Arial" w:eastAsia="Times New Roman" w:hAnsi="Arial" w:cs="Arial"/>
-                <w:sz w:val="18"/>
+                <w:sz w:val="17"/>
                 <w:szCs w:val="20"/>
               </w:rPr>
             </w:pPr>
             <w:r>
               <w:rPr>
                 <w:rFonts w:ascii="Arial" w:eastAsia="Times New Roman" w:hAnsi="Arial" w:cs="Arial"/>
-                <w:sz w:val="18"/>
-                <w:szCs w:val="20"/>
-              </w:rPr>
-              <w:t>scikit-learn (Ridge), LightGBM if there is time</w:t>
+                <w:sz w:val="17"/>
+                <w:szCs w:val="20"/>
+              </w:rPr>
+              <w:t>scikit-learn (Ridge)</w:t>
             </w:r>
           </w:p>
         </w:tc>
@@ -1196,14 +1245,14 @@
             <w:pPr>
               <w:rPr>
                 <w:rFonts w:ascii="Arial" w:eastAsia="Times New Roman" w:hAnsi="Arial" w:cs="Arial"/>
-                <w:sz w:val="18"/>
+                <w:sz w:val="17"/>
                 <w:szCs w:val="20"/>
               </w:rPr>
             </w:pPr>
             <w:r>
               <w:rPr>
                 <w:rFonts w:ascii="Arial" w:eastAsia="Times New Roman" w:hAnsi="Arial" w:cs="Arial"/>
-                <w:sz w:val="18"/>
+                <w:sz w:val="17"/>
                 <w:szCs w:val="20"/>
               </w:rPr>
               <w:t>Small tabular data set; a simple model is fast to train and easy to explain.</w:t>
@@ -1233,14 +1282,14 @@
             <w:pPr>
               <w:rPr>
                 <w:rFonts w:ascii="Arial" w:eastAsia="Times New Roman" w:hAnsi="Arial" w:cs="Arial"/>
-                <w:sz w:val="18"/>
+                <w:sz w:val="17"/>
                 <w:szCs w:val="20"/>
               </w:rPr>
             </w:pPr>
             <w:r>
               <w:rPr>
                 <w:rFonts w:ascii="Arial" w:eastAsia="Times New Roman" w:hAnsi="Arial" w:cs="Arial"/>
-                <w:sz w:val="18"/>
+                <w:sz w:val="17"/>
                 <w:szCs w:val="20"/>
               </w:rPr>
               <w:t>Serving and UI</w:t>
@@ -1268,14 +1317,14 @@
             <w:pPr>
               <w:rPr>
                 <w:rFonts w:ascii="Arial" w:eastAsia="Times New Roman" w:hAnsi="Arial" w:cs="Arial"/>
-                <w:sz w:val="18"/>
+                <w:sz w:val="17"/>
                 <w:szCs w:val="20"/>
               </w:rPr>
             </w:pPr>
             <w:r>
               <w:rPr>
                 <w:rFonts w:ascii="Arial" w:eastAsia="Times New Roman" w:hAnsi="Arial" w:cs="Arial"/>
-                <w:sz w:val="18"/>
+                <w:sz w:val="17"/>
                 <w:szCs w:val="20"/>
               </w:rPr>
               <w:t>Streamlit on Google Cloud Run</w:t>
@@ -1303,14 +1352,14 @@
             <w:pPr>
               <w:rPr>
                 <w:rFonts w:ascii="Arial" w:eastAsia="Times New Roman" w:hAnsi="Arial" w:cs="Arial"/>
-                <w:sz w:val="18"/>
+                <w:sz w:val="17"/>
                 <w:szCs w:val="20"/>
               </w:rPr>
             </w:pPr>
             <w:r>
               <w:rPr>
                 <w:rFonts w:ascii="Arial" w:eastAsia="Times New Roman" w:hAnsi="Arial" w:cs="Arial"/>
-                <w:sz w:val="18"/>
+                <w:sz w:val="17"/>
                 <w:szCs w:val="20"/>
               </w:rPr>
               <w:t>Same cloud as the feature store, paid with the GCP student credits, scales to zero when unused.</w:t>
@@ -1318,7 +1367,7 @@
             <w:r>
               <w:rPr>
                 <w:rFonts w:ascii="Arial" w:eastAsia="Times New Roman" w:hAnsi="Arial" w:cs="Arial"/>
-                <w:sz w:val="18"/>
+                <w:sz w:val="17"/>
                 <w:szCs w:val="20"/>
               </w:rPr>
               <w:t xml:space="preserve"> Shows tomorrow’s forecast and model performance versus persistence over time.</w:t>
@@ -1348,14 +1397,14 @@
             <w:pPr>
               <w:rPr>
                 <w:rFonts w:ascii="Arial" w:eastAsia="Times New Roman" w:hAnsi="Arial" w:cs="Arial"/>
-                <w:sz w:val="18"/>
+                <w:sz w:val="17"/>
                 <w:szCs w:val="20"/>
               </w:rPr>
             </w:pPr>
             <w:r>
               <w:rPr>
                 <w:rFonts w:ascii="Arial" w:eastAsia="Times New Roman" w:hAnsi="Arial" w:cs="Arial"/>
-                <w:sz w:val="18"/>
+                <w:sz w:val="17"/>
                 <w:szCs w:val="20"/>
               </w:rPr>
               <w:t>Packaging</w:t>
@@ -1383,17 +1432,17 @@
             <w:pPr>
               <w:rPr>
                 <w:rFonts w:ascii="Arial" w:eastAsia="Times New Roman" w:hAnsi="Arial" w:cs="Arial"/>
-                <w:sz w:val="18"/>
+                <w:sz w:val="17"/>
                 <w:szCs w:val="20"/>
               </w:rPr>
             </w:pPr>
             <w:r>
               <w:rPr>
                 <w:rFonts w:ascii="Arial" w:eastAsia="Times New Roman" w:hAnsi="Arial" w:cs="Arial"/>
-                <w:sz w:val="18"/>
-                <w:szCs w:val="20"/>
-              </w:rPr>
-              <w:t>Docker, uv (uv.lock)</w:t>
+                <w:sz w:val="17"/>
+                <w:szCs w:val="20"/>
+              </w:rPr>
+              <w:t>Docker (multi-stage, non-root user), uv (uv.lock)</w:t>
             </w:r>
           </w:p>
         </w:tc>
@@ -1418,17 +1467,17 @@
             <w:pPr>
               <w:rPr>
                 <w:rFonts w:ascii="Arial" w:eastAsia="Times New Roman" w:hAnsi="Arial" w:cs="Arial"/>
-                <w:sz w:val="18"/>
+                <w:sz w:val="17"/>
                 <w:szCs w:val="20"/>
               </w:rPr>
             </w:pPr>
             <w:r>
               <w:rPr>
                 <w:rFonts w:ascii="Arial" w:eastAsia="Times New Roman" w:hAnsi="Arial" w:cs="Arial"/>
-                <w:sz w:val="18"/>
-                <w:szCs w:val="20"/>
-              </w:rPr>
-              <w:t>The same environment locally and in GitHub Actions, with pinned dependencies.</w:t>
+                <w:sz w:val="17"/>
+                <w:szCs w:val="20"/>
+              </w:rPr>
+              <w:t>The same environment locally, in GitHub Actions and on Cloud Run, with pinned dependencies. Secrets only as GitHub Secrets, never in the image.</w:t>
             </w:r>
           </w:p>
         </w:tc>
@@ -1437,20 +1486,30 @@
     <w:p>
       <w:pPr>
         <w:pStyle w:val="StandardWeb"/>
-        <w:rPr>
-          <w:rFonts w:ascii="Arial" w:hAnsi="Arial" w:cs="Arial"/>
-          <w:sz w:val="19"/>
-          <w:szCs w:val="21"/>
-        </w:rPr>
-      </w:pPr>
-    </w:p>
-    <w:p>
-      <w:pPr>
-        <w:spacing w:before="60" w:after="20"/>
+        <w:spacing w:before="80" w:after="80"/>
+        <w:jc w:val="both"/>
+        <w:rPr>
+          <w:rFonts w:ascii="Arial" w:hAnsi="Arial" w:cs="Arial"/>
+          <w:sz w:val="19"/>
+          <w:szCs w:val="21"/>
+        </w:rPr>
+      </w:pPr>
+      <w:r>
+        <w:rPr>
+          <w:rFonts w:ascii="Arial" w:hAnsi="Arial"/>
+          <w:sz w:val="19"/>
+        </w:rPr>
+        <w:t>Reproducibility: data and models are never stored directly in Git [11]; Git holds code, configuration and small DVC pointer files. Every training run logs its Git commit, DVC data version, parameters, metrics and model, so each result can be traced back to its code and data.</w:t>
+      </w:r>
+    </w:p>
+    <w:p>
+      <w:pPr>
+        <w:spacing w:before="120" w:after="40"/>
         <w:rPr>
           <w:rFonts w:ascii="Arial" w:hAnsi="Arial" w:cs="Arial"/>
           <w:b/>
           <w:color w:val="0070C0"/>
+          <w:sz w:val="22"/>
         </w:rPr>
       </w:pPr>
       <w:r>
@@ -1458,367 +1517,298 @@
           <w:rFonts w:ascii="Arial" w:hAnsi="Arial" w:cs="Arial"/>
           <w:b/>
           <w:color w:val="0070C0"/>
+          <w:sz w:val="22"/>
         </w:rPr>
         <w:t>References and AI use</w:t>
       </w:r>
     </w:p>
     <w:p>
       <w:pPr>
-        <w:spacing w:before="60" w:after="20"/>
-        <w:rPr>
-          <w:rFonts w:ascii="Arial" w:hAnsi="Arial" w:cs="Arial"/>
-          <w:b/>
-          <w:color w:val="0070C0"/>
-        </w:rPr>
-      </w:pPr>
-    </w:p>
-    <w:tbl>
-      <w:tblPr>
-        <w:tblW w:w="0" w:type="auto"/>
-        <w:jc w:val="center"/>
-        <w:tblBorders>
-          <w:top w:val="nil"/>
-          <w:left w:val="nil"/>
-          <w:bottom w:val="nil"/>
-          <w:right w:val="nil"/>
-          <w:insideH w:val="nil"/>
-          <w:insideV w:val="nil"/>
-        </w:tblBorders>
-        <w:tblLook w:val="04A0" w:firstRow="1" w:lastRow="0" w:firstColumn="1" w:lastColumn="0" w:noHBand="0" w:noVBand="1"/>
-      </w:tblPr>
-      <w:tblGrid>
-        <w:gridCol w:w="4825"/>
-        <w:gridCol w:w="4814"/>
-      </w:tblGrid>
-      <w:tr>
-        <w:trPr>
-          <w:jc w:val="center"/>
-        </w:trPr>
-        <w:tc>
-          <w:tcPr>
-            <w:tcW w:w="4876" w:type="dxa"/>
-            <w:tcMar>
-              <w:top w:w="5" w:type="dxa"/>
-              <w:left w:w="5" w:type="dxa"/>
-              <w:bottom w:w="5" w:type="dxa"/>
-              <w:right w:w="20" w:type="dxa"/>
-            </w:tcMar>
-          </w:tcPr>
-          <w:p>
-            <w:pPr>
-              <w:rPr>
-                <w:rFonts w:ascii="Arial" w:hAnsi="Arial" w:cs="Arial"/>
-              </w:rPr>
-            </w:pPr>
-            <w:r>
-              <w:rPr>
-                <w:rFonts w:ascii="Arial" w:hAnsi="Arial" w:cs="Arial"/>
-                <w:sz w:val="16"/>
-              </w:rPr>
-              <w:t xml:space="preserve">[1] FOEN/BAFU, station 2606 - </w:t>
-            </w:r>
-            <w:hyperlink r:id="rId9">
-              <w:r>
-                <w:rPr>
-                  <w:rFonts w:ascii="Arial" w:hAnsi="Arial" w:cs="Arial"/>
-                  <w:color w:val="0000FF"/>
-                  <w:sz w:val="16"/>
-                  <w:szCs w:val="16"/>
-                  <w:u w:val="single"/>
-                </w:rPr>
-                <w:t>hydrodaten.admin.ch/.../2606</w:t>
-              </w:r>
-            </w:hyperlink>
-          </w:p>
-        </w:tc>
-        <w:tc>
-          <w:tcPr>
-            <w:tcW w:w="4876" w:type="dxa"/>
-            <w:tcMar>
-              <w:top w:w="5" w:type="dxa"/>
-              <w:left w:w="5" w:type="dxa"/>
-              <w:bottom w:w="5" w:type="dxa"/>
-              <w:right w:w="20" w:type="dxa"/>
-            </w:tcMar>
-          </w:tcPr>
-          <w:p>
-            <w:pPr>
-              <w:rPr>
-                <w:rFonts w:ascii="Arial" w:hAnsi="Arial" w:cs="Arial"/>
-              </w:rPr>
-            </w:pPr>
-            <w:r>
-              <w:rPr>
-                <w:rFonts w:ascii="Arial" w:hAnsi="Arial" w:cs="Arial"/>
-                <w:sz w:val="16"/>
-              </w:rPr>
-              <w:t xml:space="preserve">[5] Open-Meteo Single Runs - </w:t>
-            </w:r>
-            <w:hyperlink r:id="rId10">
-              <w:r>
-                <w:rPr>
-                  <w:rFonts w:ascii="Arial" w:hAnsi="Arial" w:cs="Arial"/>
-                  <w:color w:val="0563C1"/>
-                  <w:sz w:val="16"/>
-                  <w:u w:val="single"/>
-                </w:rPr>
-                <w:t>open-meteo.com/.../single-runs-api</w:t>
-              </w:r>
-            </w:hyperlink>
-          </w:p>
-        </w:tc>
-      </w:tr>
-      <w:tr>
-        <w:trPr>
-          <w:jc w:val="center"/>
-        </w:trPr>
-        <w:tc>
-          <w:tcPr>
-            <w:tcW w:w="4876" w:type="dxa"/>
-            <w:tcMar>
-              <w:top w:w="5" w:type="dxa"/>
-              <w:left w:w="5" w:type="dxa"/>
-              <w:bottom w:w="5" w:type="dxa"/>
-              <w:right w:w="20" w:type="dxa"/>
-            </w:tcMar>
-          </w:tcPr>
-          <w:p>
-            <w:pPr>
-              <w:rPr>
-                <w:rFonts w:ascii="Arial" w:hAnsi="Arial" w:cs="Arial"/>
-              </w:rPr>
-            </w:pPr>
-            <w:r>
-              <w:rPr>
-                <w:rFonts w:ascii="Arial" w:hAnsi="Arial" w:cs="Arial"/>
-                <w:sz w:val="16"/>
-              </w:rPr>
-              <w:t xml:space="preserve">[2] Existenz BAFU Hydrology API - </w:t>
-            </w:r>
-            <w:hyperlink r:id="rId11">
-              <w:r>
-                <w:rPr>
-                  <w:rFonts w:ascii="Arial" w:hAnsi="Arial" w:cs="Arial"/>
-                  <w:color w:val="0000FF"/>
-                  <w:sz w:val="16"/>
-                  <w:szCs w:val="16"/>
-                  <w:u w:val="single"/>
-                </w:rPr>
-                <w:t>api.existenz.ch</w:t>
-              </w:r>
-            </w:hyperlink>
-          </w:p>
-        </w:tc>
-        <w:tc>
-          <w:tcPr>
-            <w:tcW w:w="4876" w:type="dxa"/>
-            <w:tcMar>
-              <w:top w:w="5" w:type="dxa"/>
-              <w:left w:w="5" w:type="dxa"/>
-              <w:bottom w:w="5" w:type="dxa"/>
-              <w:right w:w="20" w:type="dxa"/>
-            </w:tcMar>
-          </w:tcPr>
-          <w:p>
-            <w:pPr>
-              <w:rPr>
-                <w:rFonts w:ascii="Arial" w:hAnsi="Arial" w:cs="Arial"/>
-              </w:rPr>
-            </w:pPr>
-            <w:r>
-              <w:rPr>
-                <w:rFonts w:ascii="Arial" w:hAnsi="Arial" w:cs="Arial"/>
-                <w:sz w:val="16"/>
-              </w:rPr>
-              <w:t xml:space="preserve">[6] Eawag Alplakes - </w:t>
-            </w:r>
-            <w:hyperlink r:id="rId12">
-              <w:r>
-                <w:rPr>
-                  <w:rFonts w:ascii="Arial" w:hAnsi="Arial" w:cs="Arial"/>
-                  <w:color w:val="0000FF"/>
-                  <w:sz w:val="16"/>
-                  <w:szCs w:val="16"/>
-                  <w:u w:val="single"/>
-                </w:rPr>
-                <w:t>alplakes.eawag.ch</w:t>
-              </w:r>
-            </w:hyperlink>
-          </w:p>
-        </w:tc>
-      </w:tr>
-      <w:tr>
-        <w:trPr>
-          <w:jc w:val="center"/>
-        </w:trPr>
-        <w:tc>
-          <w:tcPr>
-            <w:tcW w:w="4876" w:type="dxa"/>
-            <w:tcMar>
-              <w:top w:w="5" w:type="dxa"/>
-              <w:left w:w="5" w:type="dxa"/>
-              <w:bottom w:w="5" w:type="dxa"/>
-              <w:right w:w="20" w:type="dxa"/>
-            </w:tcMar>
-          </w:tcPr>
-          <w:p>
-            <w:pPr>
-              <w:rPr>
-                <w:rFonts w:ascii="Arial" w:hAnsi="Arial" w:cs="Arial"/>
-              </w:rPr>
-            </w:pPr>
-            <w:r>
-              <w:rPr>
-                <w:rFonts w:ascii="Arial" w:hAnsi="Arial" w:cs="Arial"/>
-                <w:sz w:val="16"/>
-              </w:rPr>
-              <w:t xml:space="preserve">[3] LINDAS SPARQL endpoint - </w:t>
-            </w:r>
-            <w:hyperlink r:id="rId13">
-              <w:r>
-                <w:rPr>
-                  <w:rFonts w:ascii="Arial" w:hAnsi="Arial" w:cs="Arial"/>
-                  <w:color w:val="0000FF"/>
-                  <w:sz w:val="16"/>
-                  <w:szCs w:val="16"/>
-                  <w:u w:val="single"/>
-                </w:rPr>
-                <w:t>ld.admin.ch/query</w:t>
-              </w:r>
-            </w:hyperlink>
-          </w:p>
-        </w:tc>
-        <w:tc>
-          <w:tcPr>
-            <w:tcW w:w="4876" w:type="dxa"/>
-            <w:tcMar>
-              <w:top w:w="5" w:type="dxa"/>
-              <w:left w:w="5" w:type="dxa"/>
-              <w:bottom w:w="5" w:type="dxa"/>
-              <w:right w:w="20" w:type="dxa"/>
-            </w:tcMar>
-          </w:tcPr>
-          <w:p>
-            <w:pPr>
-              <w:rPr>
-                <w:rFonts w:ascii="Arial" w:hAnsi="Arial" w:cs="Arial"/>
-              </w:rPr>
-            </w:pPr>
-            <w:r>
-              <w:rPr>
-                <w:rFonts w:ascii="Arial" w:hAnsi="Arial" w:cs="Arial"/>
-                <w:sz w:val="16"/>
-              </w:rPr>
-              <w:t xml:space="preserve">[7] HSLU MLOps project showcase - </w:t>
-            </w:r>
-            <w:hyperlink r:id="rId14">
-              <w:r>
-                <w:rPr>
-                  <w:rFonts w:ascii="Arial" w:hAnsi="Arial" w:cs="Arial"/>
-                  <w:color w:val="0000FF"/>
-                  <w:sz w:val="16"/>
-                  <w:szCs w:val="16"/>
-                  <w:u w:val="single"/>
-                </w:rPr>
-                <w:t>mlops-lab.ch</w:t>
-              </w:r>
-            </w:hyperlink>
-          </w:p>
-        </w:tc>
-      </w:tr>
-      <w:tr>
-        <w:trPr>
-          <w:jc w:val="center"/>
-        </w:trPr>
-        <w:tc>
-          <w:tcPr>
-            <w:tcW w:w="4876" w:type="dxa"/>
-            <w:tcMar>
-              <w:top w:w="5" w:type="dxa"/>
-              <w:left w:w="5" w:type="dxa"/>
-              <w:bottom w:w="5" w:type="dxa"/>
-              <w:right w:w="20" w:type="dxa"/>
-            </w:tcMar>
-          </w:tcPr>
-          <w:p>
-            <w:pPr>
-              <w:rPr>
-                <w:rFonts w:ascii="Arial" w:hAnsi="Arial" w:cs="Arial"/>
-              </w:rPr>
-            </w:pPr>
-            <w:r>
-              <w:rPr>
-                <w:rFonts w:ascii="Arial" w:hAnsi="Arial" w:cs="Arial"/>
-                <w:sz w:val="16"/>
-              </w:rPr>
-              <w:t xml:space="preserve">[4] Open-Meteo Forecast API - </w:t>
-            </w:r>
-            <w:hyperlink r:id="rId15">
-              <w:r>
-                <w:rPr>
-                  <w:rFonts w:ascii="Arial" w:hAnsi="Arial" w:cs="Arial"/>
-                  <w:color w:val="0000FF"/>
-                  <w:sz w:val="16"/>
-                  <w:szCs w:val="16"/>
-                  <w:u w:val="single"/>
-                </w:rPr>
-                <w:t>open-meteo.com/en/docs</w:t>
-              </w:r>
-            </w:hyperlink>
-          </w:p>
-        </w:tc>
-        <w:tc>
-          <w:tcPr>
-            <w:tcW w:w="4876" w:type="dxa"/>
-            <w:tcMar>
-              <w:top w:w="5" w:type="dxa"/>
-              <w:left w:w="5" w:type="dxa"/>
-              <w:bottom w:w="5" w:type="dxa"/>
-              <w:right w:w="20" w:type="dxa"/>
-            </w:tcMar>
-          </w:tcPr>
-          <w:p>
-            <w:pPr>
-              <w:rPr>
-                <w:rFonts w:ascii="Arial" w:hAnsi="Arial" w:cs="Arial"/>
-              </w:rPr>
-            </w:pPr>
-            <w:r>
-              <w:rPr>
-                <w:rFonts w:ascii="Arial" w:hAnsi="Arial" w:cs="Arial"/>
-                <w:sz w:val="16"/>
-              </w:rPr>
-              <w:t xml:space="preserve">[8] KTH ID2223 project archive - </w:t>
-            </w:r>
-            <w:hyperlink r:id="rId16">
-              <w:r>
-                <w:rPr>
-                  <w:rFonts w:ascii="Arial" w:hAnsi="Arial" w:cs="Arial"/>
-                  <w:color w:val="0000FF"/>
-                  <w:sz w:val="16"/>
-                  <w:szCs w:val="16"/>
-                  <w:u w:val="single"/>
-                </w:rPr>
-                <w:t>id2223kth.github.io</w:t>
-              </w:r>
-            </w:hyperlink>
-          </w:p>
-        </w:tc>
-      </w:tr>
-    </w:tbl>
-    <w:p>
-      <w:pPr>
-        <w:spacing w:before="20"/>
+        <w:rPr>
+          <w:rFonts w:ascii="Arial" w:hAnsi="Arial" w:cs="Arial"/>
+          <w:sz w:val="16"/>
+        </w:rPr>
+      </w:pPr>
+      <w:r>
+        <w:rPr>
+          <w:rFonts w:ascii="Arial" w:hAnsi="Arial"/>
+          <w:sz w:val="16"/>
+        </w:rPr>
+        <w:t xml:space="preserve">[1] FOEN/BAFU (2026). Hydrological data, station 2606 Rhône, Genève Halle de l'Île, and BAFU Data Platform Hydrological Observations API. accessed on 02.10.2026 from </w:t>
+      </w:r>
+      <w:hyperlink r:id="rId9" w:history="1">
+        <w:r>
+          <w:rPr>
+            <w:rStyle w:val="Hyperlink"/>
+            <w:rFonts w:ascii="Arial" w:hAnsi="Arial"/>
+            <w:sz w:val="16"/>
+          </w:rPr>
+          <w:t>hydrodaten.admin.ch</w:t>
+        </w:r>
+      </w:hyperlink>
+      <w:r>
+        <w:rPr>
+          <w:rFonts w:ascii="Arial" w:hAnsi="Arial"/>
+          <w:sz w:val="16"/>
+        </w:rPr>
+        <w:t xml:space="preserve"> and </w:t>
+      </w:r>
+      <w:hyperlink r:id="rId10" w:history="1">
+        <w:r>
+          <w:rPr>
+            <w:rStyle w:val="Hyperlink"/>
+            <w:rFonts w:ascii="Arial" w:hAnsi="Arial"/>
+            <w:sz w:val="16"/>
+          </w:rPr>
+          <w:t>data.bafu.admin.ch</w:t>
+        </w:r>
+      </w:hyperlink>
+    </w:p>
+    <w:p>
+      <w:pPr>
+        <w:rPr>
+          <w:rFonts w:ascii="Arial" w:hAnsi="Arial" w:cs="Arial"/>
+          <w:sz w:val="16"/>
+        </w:rPr>
+      </w:pPr>
+      <w:r>
+        <w:rPr>
+          <w:rFonts w:ascii="Arial" w:hAnsi="Arial" w:cs="Arial"/>
+          <w:sz w:val="16"/>
+        </w:rPr>
+        <w:t xml:space="preserve">[2] Existenz.ch (2026). Hydrology API (republished BAFU data). accessed on 01.10.2026 from </w:t>
+      </w:r>
+      <w:hyperlink r:id="rId11" w:history="1">
+        <w:r>
+          <w:rPr>
+            <w:rStyle w:val="Hyperlink"/>
+            <w:rFonts w:ascii="Arial" w:hAnsi="Arial" w:cs="Arial"/>
+            <w:sz w:val="16"/>
+          </w:rPr>
+          <w:t>api.existenz.ch</w:t>
+        </w:r>
+      </w:hyperlink>
+    </w:p>
+    <w:p>
+      <w:pPr>
+        <w:rPr>
+          <w:rFonts w:ascii="Arial" w:hAnsi="Arial" w:cs="Arial"/>
+          <w:sz w:val="16"/>
+        </w:rPr>
+      </w:pPr>
+      <w:r>
+        <w:rPr>
+          <w:rFonts w:ascii="Arial" w:hAnsi="Arial" w:cs="Arial"/>
+          <w:sz w:val="16"/>
+        </w:rPr>
+        <w:t xml:space="preserve">[3] LINDAS (2026). Linked Data Service of the Swiss federal administration, SPARQL endpoint. accessed on 30.09.2026 from </w:t>
+      </w:r>
+      <w:hyperlink r:id="rId12" w:history="1">
+        <w:r>
+          <w:rPr>
+            <w:rStyle w:val="Hyperlink"/>
+            <w:rFonts w:ascii="Arial" w:hAnsi="Arial" w:cs="Arial"/>
+            <w:sz w:val="16"/>
+          </w:rPr>
+          <w:t>ld.admin.ch/query</w:t>
+        </w:r>
+      </w:hyperlink>
+    </w:p>
+    <w:p>
+      <w:pPr>
+        <w:rPr>
+          <w:rFonts w:ascii="Arial" w:hAnsi="Arial" w:cs="Arial"/>
+          <w:sz w:val="16"/>
+        </w:rPr>
+      </w:pPr>
+      <w:r>
+        <w:rPr>
+          <w:rFonts w:ascii="Arial" w:hAnsi="Arial" w:cs="Arial"/>
+          <w:sz w:val="16"/>
+        </w:rPr>
+        <w:t xml:space="preserve">[4] Open-Meteo (2026). Weather Forecast API. accessed on 29.09.2026 from </w:t>
+      </w:r>
+      <w:hyperlink r:id="rId13" w:history="1">
+        <w:r>
+          <w:rPr>
+            <w:rStyle w:val="Hyperlink"/>
+            <w:rFonts w:ascii="Arial" w:hAnsi="Arial" w:cs="Arial"/>
+            <w:sz w:val="16"/>
+          </w:rPr>
+          <w:t>open-meteo.com/en/docs</w:t>
+        </w:r>
+      </w:hyperlink>
+    </w:p>
+    <w:p>
+      <w:pPr>
+        <w:rPr>
+          <w:rFonts w:ascii="Arial" w:hAnsi="Arial" w:cs="Arial"/>
+          <w:sz w:val="16"/>
+        </w:rPr>
+      </w:pPr>
+      <w:r>
+        <w:rPr>
+          <w:rFonts w:ascii="Arial" w:hAnsi="Arial" w:cs="Arial"/>
+          <w:sz w:val="16"/>
+        </w:rPr>
+        <w:t xml:space="preserve">[5] Open-Meteo (2026). Single Runs API. accessed on 30.09.2026 from </w:t>
+      </w:r>
+      <w:hyperlink r:id="rId14" w:history="1">
+        <w:r>
+          <w:rPr>
+            <w:rStyle w:val="Hyperlink"/>
+            <w:rFonts w:ascii="Arial" w:hAnsi="Arial" w:cs="Arial"/>
+            <w:sz w:val="16"/>
+          </w:rPr>
+          <w:t>open-meteo.com/en/docs/single-runs-api</w:t>
+        </w:r>
+      </w:hyperlink>
+    </w:p>
+    <w:p>
+      <w:pPr>
+        <w:rPr>
+          <w:rFonts w:ascii="Arial" w:hAnsi="Arial" w:cs="Arial"/>
+          <w:sz w:val="16"/>
+        </w:rPr>
+      </w:pPr>
+      <w:r>
+        <w:rPr>
+          <w:rFonts w:ascii="Arial" w:hAnsi="Arial" w:cs="Arial"/>
+          <w:sz w:val="16"/>
+        </w:rPr>
+        <w:t xml:space="preserve">[6] Eawag (2026). Alplakes, lake simulations and forecasts. accessed on 29.09.2026 from </w:t>
+      </w:r>
+      <w:hyperlink r:id="rId15" w:history="1">
+        <w:r>
+          <w:rPr>
+            <w:rStyle w:val="Hyperlink"/>
+            <w:rFonts w:ascii="Arial" w:hAnsi="Arial" w:cs="Arial"/>
+            <w:sz w:val="16"/>
+          </w:rPr>
+          <w:t>alplakes.eawag.ch</w:t>
+        </w:r>
+      </w:hyperlink>
+    </w:p>
+    <w:p>
+      <w:pPr>
+        <w:rPr>
+          <w:rFonts w:ascii="Arial" w:hAnsi="Arial" w:cs="Arial"/>
+          <w:sz w:val="16"/>
+        </w:rPr>
+      </w:pPr>
+      <w:r>
+        <w:rPr>
+          <w:rFonts w:ascii="Arial" w:hAnsi="Arial" w:cs="Arial"/>
+          <w:sz w:val="16"/>
+        </w:rPr>
+        <w:t xml:space="preserve">[7] HSLU (2026). MLOps student projects FS26. accessed on 29.09.2026 from </w:t>
+      </w:r>
+      <w:hyperlink r:id="rId16" w:history="1">
+        <w:r>
+          <w:rPr>
+            <w:rStyle w:val="Hyperlink"/>
+            <w:rFonts w:ascii="Arial" w:hAnsi="Arial" w:cs="Arial"/>
+            <w:sz w:val="16"/>
+          </w:rPr>
+          <w:t>mlops-lab.ch/semesters/fs26.html</w:t>
+        </w:r>
+      </w:hyperlink>
+    </w:p>
+    <w:p>
+      <w:pPr>
+        <w:rPr>
+          <w:rFonts w:ascii="Arial" w:hAnsi="Arial" w:cs="Arial"/>
+          <w:sz w:val="16"/>
+        </w:rPr>
+      </w:pPr>
+      <w:r>
+        <w:rPr>
+          <w:rFonts w:ascii="Arial" w:hAnsi="Arial" w:cs="Arial"/>
+          <w:sz w:val="16"/>
+        </w:rPr>
+        <w:t xml:space="preserve">[8] KTH (2024, 2025). ID2223 project showcases. accessed on 29.09.2026 from </w:t>
+      </w:r>
+      <w:hyperlink r:id="rId17" w:history="1">
+        <w:r>
+          <w:rPr>
+            <w:rStyle w:val="Hyperlink"/>
+            <w:rFonts w:ascii="Arial" w:hAnsi="Arial" w:cs="Arial"/>
+            <w:sz w:val="16"/>
+          </w:rPr>
+          <w:t>id2223kth.github.io</w:t>
+        </w:r>
+      </w:hyperlink>
+    </w:p>
+    <w:p>
+      <w:pPr>
+        <w:rPr>
+          <w:rFonts w:ascii="Arial" w:hAnsi="Arial" w:cs="Arial"/>
+          <w:sz w:val="16"/>
+        </w:rPr>
+      </w:pPr>
+      <w:r>
+        <w:rPr>
+          <w:rFonts w:ascii="Arial" w:hAnsi="Arial" w:cs="Arial"/>
+          <w:sz w:val="16"/>
+        </w:rPr>
+        <w:t xml:space="preserve">[9] DVC (2026). Data Version Control documentation. accessed on 02.10.2026 from </w:t>
+      </w:r>
+      <w:hyperlink r:id="rId18" w:history="1">
+        <w:r>
+          <w:rPr>
+            <w:rStyle w:val="Hyperlink"/>
+            <w:rFonts w:ascii="Arial" w:hAnsi="Arial" w:cs="Arial"/>
+            <w:sz w:val="16"/>
+          </w:rPr>
+          <w:t>dvc.org/doc</w:t>
+        </w:r>
+      </w:hyperlink>
+    </w:p>
+    <w:p>
+      <w:pPr>
+        <w:rPr>
+          <w:rFonts w:ascii="Arial" w:hAnsi="Arial" w:cs="Arial"/>
+          <w:sz w:val="16"/>
+        </w:rPr>
+      </w:pPr>
+      <w:r>
+        <w:rPr>
+          <w:rFonts w:ascii="Arial" w:hAnsi="Arial" w:cs="Arial"/>
+          <w:sz w:val="16"/>
+        </w:rPr>
+        <w:t xml:space="preserve">[10] DagsHub (2026). MLflow tracking integration. accessed on 02.10.2026 from </w:t>
+      </w:r>
+      <w:hyperlink r:id="rId19" w:history="1">
+        <w:r>
+          <w:rPr>
+            <w:rStyle w:val="Hyperlink"/>
+            <w:rFonts w:ascii="Arial" w:hAnsi="Arial" w:cs="Arial"/>
+            <w:sz w:val="16"/>
+          </w:rPr>
+          <w:t>dagshub.com/docs/integration_guide/mlflow_tracking</w:t>
+        </w:r>
+      </w:hyperlink>
+    </w:p>
+    <w:p>
+      <w:pPr>
         <w:rPr>
           <w:rFonts w:ascii="Arial" w:hAnsi="Arial" w:cs="Arial"/>
           <w:b/>
           <w:sz w:val="16"/>
         </w:rPr>
       </w:pPr>
+      <w:r>
+        <w:rPr>
+          <w:rFonts w:ascii="Arial" w:hAnsi="Arial" w:cs="Arial"/>
+          <w:sz w:val="16"/>
+        </w:rPr>
+        <w:t xml:space="preserve">[11] Bär, Florian (2026). Versioning and Containerization, MLOps HS26 Block 1, lecture slides. Lucerne University of Applied Sciences and Arts.  </w:t>
+      </w:r>
     </w:p>
     <w:p>
       <w:pPr>
         <w:spacing w:before="20"/>
+        <w:jc w:val="both"/>
         <w:rPr>
           <w:rFonts w:ascii="Arial" w:hAnsi="Arial" w:cs="Arial"/>
         </w:rPr>
@@ -1840,12 +1830,10 @@
       </w:r>
     </w:p>
     <w:sectPr>
-      <w:headerReference w:type="even" r:id="rId17"/>
-      <w:headerReference w:type="default" r:id="rId18"/>
-      <w:footerReference w:type="even" r:id="rId19"/>
-      <w:footerReference w:type="default" r:id="rId20"/>
-      <w:headerReference w:type="first" r:id="rId21"/>
-      <w:footerReference w:type="first" r:id="rId22"/>
+      <w:headerReference w:type="default" r:id="rId20"/>
+      <w:footerReference w:type="default" r:id="rId21"/>
+      <w:headerReference w:type="first" r:id="rId22"/>
+      <w:footerReference w:type="first" r:id="rId23"/>
       <w:pgSz w:w="11907" w:h="16840"/>
       <w:pgMar w:top="1361" w:right="1134" w:bottom="1247" w:left="1134" w:header="567" w:footer="510" w:gutter="0"/>
       <w:cols w:space="708"/>
@@ -1880,7 +1868,122 @@
   <w:p>
     <w:pPr>
       <w:pStyle w:val="Fuzeile"/>
+      <w:pBdr>
+        <w:top w:val="single" w:sz="4" w:space="0" w:color="auto"/>
+      </w:pBdr>
+      <w:tabs>
+        <w:tab w:val="clear" w:pos="4536"/>
+        <w:tab w:val="clear" w:pos="9072"/>
+        <w:tab w:val="center" w:pos="4819"/>
+        <w:tab w:val="right" w:pos="9639"/>
+      </w:tabs>
+      <w:rPr>
+        <w:rFonts w:ascii="Arial" w:hAnsi="Arial" w:cs="Arial"/>
+        <w:sz w:val="16"/>
+      </w:rPr>
     </w:pPr>
+    <w:r>
+      <w:rPr>
+        <w:rFonts w:ascii="Arial" w:hAnsi="Arial" w:cs="Arial"/>
+        <w:sz w:val="16"/>
+      </w:rPr>
+      <w:t>02.10.2026</w:t>
+    </w:r>
+    <w:r>
+      <w:rPr>
+        <w:rFonts w:ascii="Arial" w:hAnsi="Arial" w:cs="Arial"/>
+        <w:sz w:val="16"/>
+      </w:rPr>
+      <w:tab/>
+      <w:t xml:space="preserve">Page </w:t>
+    </w:r>
+    <w:r>
+      <w:rPr>
+        <w:rFonts w:ascii="Arial" w:hAnsi="Arial" w:cs="Arial"/>
+        <w:sz w:val="16"/>
+      </w:rPr>
+      <w:fldChar w:fldCharType="begin"/>
+    </w:r>
+    <w:r>
+      <w:rPr>
+        <w:rFonts w:ascii="Arial" w:hAnsi="Arial" w:cs="Arial"/>
+        <w:sz w:val="16"/>
+      </w:rPr>
+      <w:instrText xml:space="preserve"> PAGE  \* MERGEFORMAT </w:instrText>
+    </w:r>
+    <w:r>
+      <w:rPr>
+        <w:rFonts w:ascii="Arial" w:hAnsi="Arial" w:cs="Arial"/>
+        <w:sz w:val="16"/>
+      </w:rPr>
+      <w:fldChar w:fldCharType="separate"/>
+    </w:r>
+    <w:r>
+      <w:rPr>
+        <w:rFonts w:ascii="Arial" w:hAnsi="Arial" w:cs="Arial"/>
+        <w:noProof/>
+        <w:sz w:val="16"/>
+      </w:rPr>
+      <w:t>1</w:t>
+    </w:r>
+    <w:r>
+      <w:rPr>
+        <w:rFonts w:ascii="Arial" w:hAnsi="Arial" w:cs="Arial"/>
+        <w:sz w:val="16"/>
+      </w:rPr>
+      <w:fldChar w:fldCharType="end"/>
+    </w:r>
+    <w:r>
+      <w:rPr>
+        <w:rFonts w:ascii="Arial" w:hAnsi="Arial" w:cs="Arial"/>
+        <w:sz w:val="16"/>
+      </w:rPr>
+      <w:t xml:space="preserve"> of </w:t>
+    </w:r>
+    <w:r>
+      <w:rPr>
+        <w:rFonts w:ascii="Arial" w:hAnsi="Arial" w:cs="Arial"/>
+        <w:sz w:val="16"/>
+      </w:rPr>
+      <w:fldChar w:fldCharType="begin"/>
+    </w:r>
+    <w:r>
+      <w:rPr>
+        <w:rFonts w:ascii="Arial" w:hAnsi="Arial" w:cs="Arial"/>
+        <w:sz w:val="16"/>
+      </w:rPr>
+      <w:instrText xml:space="preserve"> NUMPAGES  \* MERGEFORMAT </w:instrText>
+    </w:r>
+    <w:r>
+      <w:rPr>
+        <w:rFonts w:ascii="Arial" w:hAnsi="Arial" w:cs="Arial"/>
+        <w:sz w:val="16"/>
+      </w:rPr>
+      <w:fldChar w:fldCharType="separate"/>
+    </w:r>
+    <w:r>
+      <w:rPr>
+        <w:rFonts w:ascii="Arial" w:hAnsi="Arial" w:cs="Arial"/>
+        <w:noProof/>
+        <w:sz w:val="16"/>
+      </w:rPr>
+      <w:t>2</w:t>
+    </w:r>
+    <w:r>
+      <w:rPr>
+        <w:rFonts w:ascii="Arial" w:hAnsi="Arial" w:cs="Arial"/>
+        <w:sz w:val="16"/>
+      </w:rPr>
+      <w:fldChar w:fldCharType="end"/>
+    </w:r>
+    <w:r>
+      <w:rPr>
+        <w:rFonts w:ascii="Arial" w:hAnsi="Arial" w:cs="Arial"/>
+        <w:sz w:val="16"/>
+      </w:rPr>
+      <w:tab/>
+      <w:t>MLOps HS26 Project Proposal</w:t>
+    </w:r>
   </w:p>
 </w:ftr>
 </file>
@@ -1909,132 +2012,7 @@
         <w:rFonts w:ascii="Arial" w:hAnsi="Arial" w:cs="Arial"/>
         <w:sz w:val="16"/>
       </w:rPr>
-      <w:t>01.10.2026</w:t>
-    </w:r>
-    <w:r>
-      <w:rPr>
-        <w:rFonts w:ascii="Arial" w:hAnsi="Arial" w:cs="Arial"/>
-        <w:sz w:val="16"/>
-      </w:rPr>
-      <w:tab/>
-      <w:t xml:space="preserve">Page </w:t>
-    </w:r>
-    <w:r>
-      <w:rPr>
-        <w:rFonts w:ascii="Arial" w:hAnsi="Arial" w:cs="Arial"/>
-        <w:sz w:val="16"/>
-      </w:rPr>
-      <w:fldChar w:fldCharType="begin"/>
-    </w:r>
-    <w:r>
-      <w:rPr>
-        <w:rFonts w:ascii="Arial" w:hAnsi="Arial" w:cs="Arial"/>
-        <w:sz w:val="16"/>
-      </w:rPr>
-      <w:instrText xml:space="preserve"> PAGE  \* MERGEFORMAT </w:instrText>
-    </w:r>
-    <w:r>
-      <w:rPr>
-        <w:rFonts w:ascii="Arial" w:hAnsi="Arial" w:cs="Arial"/>
-        <w:sz w:val="16"/>
-      </w:rPr>
-      <w:fldChar w:fldCharType="separate"/>
-    </w:r>
-    <w:r>
-      <w:rPr>
-        <w:rFonts w:ascii="Arial" w:hAnsi="Arial" w:cs="Arial"/>
-        <w:noProof/>
-        <w:sz w:val="16"/>
-      </w:rPr>
-      <w:t>1</w:t>
-    </w:r>
-    <w:r>
-      <w:rPr>
-        <w:rFonts w:ascii="Arial" w:hAnsi="Arial" w:cs="Arial"/>
-        <w:sz w:val="16"/>
-      </w:rPr>
-      <w:fldChar w:fldCharType="end"/>
-    </w:r>
-    <w:r>
-      <w:rPr>
-        <w:rFonts w:ascii="Arial" w:hAnsi="Arial" w:cs="Arial"/>
-        <w:sz w:val="16"/>
-      </w:rPr>
-      <w:t xml:space="preserve"> of </w:t>
-    </w:r>
-    <w:r>
-      <w:rPr>
-        <w:rFonts w:ascii="Arial" w:hAnsi="Arial" w:cs="Arial"/>
-        <w:sz w:val="16"/>
-      </w:rPr>
-      <w:fldChar w:fldCharType="begin"/>
-    </w:r>
-    <w:r>
-      <w:rPr>
-        <w:rFonts w:ascii="Arial" w:hAnsi="Arial" w:cs="Arial"/>
-        <w:sz w:val="16"/>
-      </w:rPr>
-      <w:instrText xml:space="preserve"> NUMPAGES  \* MERGEFORMAT </w:instrText>
-    </w:r>
-    <w:r>
-      <w:rPr>
-        <w:rFonts w:ascii="Arial" w:hAnsi="Arial" w:cs="Arial"/>
-        <w:sz w:val="16"/>
-      </w:rPr>
-      <w:fldChar w:fldCharType="separate"/>
-    </w:r>
-    <w:r>
-      <w:rPr>
-        <w:rFonts w:ascii="Arial" w:hAnsi="Arial" w:cs="Arial"/>
-        <w:noProof/>
-        <w:sz w:val="16"/>
-      </w:rPr>
-      <w:t>2</w:t>
-    </w:r>
-    <w:r>
-      <w:rPr>
-        <w:rFonts w:ascii="Arial" w:hAnsi="Arial" w:cs="Arial"/>
-        <w:sz w:val="16"/>
-      </w:rPr>
-      <w:fldChar w:fldCharType="end"/>
-    </w:r>
-    <w:r>
-      <w:rPr>
-        <w:rFonts w:ascii="Arial" w:hAnsi="Arial" w:cs="Arial"/>
-        <w:sz w:val="16"/>
-      </w:rPr>
-      <w:tab/>
-      <w:t>MLOps HS26 Project Proposal</w:t>
-    </w:r>
-  </w:p>
-</w:ftr>
-</file>
-
-<file path=word/footer3.xml><?xml version="1.0" encoding="utf-8"?>
-<w:ftr xmlns:wpc="http://schemas.microsoft.com/office/word/2010/wordprocessingCanvas" xmlns:cx="http://schemas.microsoft.com/office/drawing/2014/chartex" xmlns:cx1="http://schemas.microsoft.com/office/drawing/2015/9/8/chartex" xmlns:cx2="http://schemas.microsoft.com/office/drawing/2015/10/21/chartex" xmlns:cx3="http://schemas.microsoft.com/office/drawing/2016/5/9/chartex" xmlns:cx4="http://schemas.microsoft.com/office/drawing/2016/5/10/chartex" xmlns:cx5="http://schemas.microsoft.com/office/drawing/2016/5/11/chartex" xmlns:cx6="http://schemas.microsoft.com/office/drawing/2016/5/12/chartex" xmlns:cx7="http://schemas.microsoft.com/office/drawing/2016/5/13/chartex" xmlns:cx8="http://schemas.microsoft.com/office/drawing/2016/5/14/chartex" xmlns:mc="http://schemas.openxmlformats.org/markup-compatibility/2006" xmlns:aink="http://schemas.microsoft.com/office/drawing/2016/ink" xmlns:am3d="http://schemas.microsoft.com/office/drawing/2017/model3d" xmlns:o="urn:schemas-microsoft-com:office:office" xmlns:oel="http://schemas.microsoft.com/office/2019/extlst" xmlns:r="http://schemas.openxmlformats.org/officeDocument/2006/relationships" xmlns:m="http://schemas.openxmlformats.org/officeDocument/2006/math" xmlns:v="urn:schemas-microsoft-com:vml" xmlns:wp14="http://schemas.microsoft.com/office/word/2010/wordprocessingDrawing" xmlns:wp="http://schemas.openxmlformats.org/drawingml/2006/wordprocessingDrawing" xmlns:w10="urn:schemas-microsoft-com:office:word" xmlns:w="http://schemas.openxmlformats.org/wordprocessingml/2006/main" xmlns:w14="http://schemas.microsoft.com/office/word/2010/wordml" xmlns:w15="http://schemas.microsoft.com/office/word/2012/wordml" xmlns:w16cex="http://schemas.microsoft.com/office/word/2018/wordml/cex" xmlns:w16cid="http://schemas.microsoft.com/office/word/2016/wordml/cid" xmlns:w16="http://schemas.microsoft.com/office/word/2018/wordml" xmlns:w16du="http://schemas.microsoft.com/office/word/2023/wordml/word16du" xmlns:w16sdtdh="http://schemas.microsoft.com/office/word/2020/wordml/sdtdatahash" xmlns:w16sdtfl="http://schemas.microsoft.com/office/word/2024/wordml/sdtformatlock" xmlns:w16se="http://schemas.microsoft.com/office/word/2015/wordml/symex" xmlns:wpg="http://schemas.microsoft.com/office/word/2010/wordprocessingGroup" xmlns:wpi="http://schemas.microsoft.com/office/word/2010/wordprocessingInk" xmlns:wne="http://schemas.microsoft.com/office/word/2006/wordml" xmlns:wps="http://schemas.microsoft.com/office/word/2010/wordprocessingShape" mc:Ignorable="w14 w15 w16se w16cid w16 w16cex w16sdtdh w16sdtfl w16du wp14">
-  <w:p>
-    <w:pPr>
-      <w:pStyle w:val="Fuzeile"/>
-      <w:pBdr>
-        <w:top w:val="single" w:sz="4" w:space="0" w:color="auto"/>
-      </w:pBdr>
-      <w:tabs>
-        <w:tab w:val="clear" w:pos="4536"/>
-        <w:tab w:val="clear" w:pos="9072"/>
-        <w:tab w:val="center" w:pos="4819"/>
-        <w:tab w:val="right" w:pos="9639"/>
-      </w:tabs>
-      <w:rPr>
-        <w:rFonts w:ascii="Arial" w:hAnsi="Arial" w:cs="Arial"/>
-        <w:sz w:val="16"/>
-      </w:rPr>
-    </w:pPr>
-    <w:r>
-      <w:rPr>
-        <w:rFonts w:ascii="Arial" w:hAnsi="Arial" w:cs="Arial"/>
-        <w:sz w:val="16"/>
-      </w:rPr>
-      <w:t>01.10.2026</w:t>
+      <w:t>02.10.2026</w:t>
     </w:r>
     <w:r>
       <w:rPr>
@@ -2159,16 +2137,6 @@
   <w:p>
     <w:pPr>
       <w:pStyle w:val="Kopfzeile"/>
-    </w:pPr>
-  </w:p>
-</w:hdr>
-</file>
-
-<file path=word/header2.xml><?xml version="1.0" encoding="utf-8"?>
-<w:hdr xmlns:wpc="http://schemas.microsoft.com/office/word/2010/wordprocessingCanvas" xmlns:cx="http://schemas.microsoft.com/office/drawing/2014/chartex" xmlns:cx1="http://schemas.microsoft.com/office/drawing/2015/9/8/chartex" xmlns:cx2="http://schemas.microsoft.com/office/drawing/2015/10/21/chartex" xmlns:cx3="http://schemas.microsoft.com/office/drawing/2016/5/9/chartex" xmlns:cx4="http://schemas.microsoft.com/office/drawing/2016/5/10/chartex" xmlns:cx5="http://schemas.microsoft.com/office/drawing/2016/5/11/chartex" xmlns:cx6="http://schemas.microsoft.com/office/drawing/2016/5/12/chartex" xmlns:cx7="http://schemas.microsoft.com/office/drawing/2016/5/13/chartex" xmlns:cx8="http://schemas.microsoft.com/office/drawing/2016/5/14/chartex" xmlns:mc="http://schemas.openxmlformats.org/markup-compatibility/2006" xmlns:aink="http://schemas.microsoft.com/office/drawing/2016/ink" xmlns:am3d="http://schemas.microsoft.com/office/drawing/2017/model3d" xmlns:o="urn:schemas-microsoft-com:office:office" xmlns:oel="http://schemas.microsoft.com/office/2019/extlst" xmlns:r="http://schemas.openxmlformats.org/officeDocument/2006/relationships" xmlns:m="http://schemas.openxmlformats.org/officeDocument/2006/math" xmlns:v="urn:schemas-microsoft-com:vml" xmlns:wp14="http://schemas.microsoft.com/office/word/2010/wordprocessingDrawing" xmlns:wp="http://schemas.openxmlformats.org/drawingml/2006/wordprocessingDrawing" xmlns:w10="urn:schemas-microsoft-com:office:word" xmlns:w="http://schemas.openxmlformats.org/wordprocessingml/2006/main" xmlns:w14="http://schemas.microsoft.com/office/word/2010/wordml" xmlns:w15="http://schemas.microsoft.com/office/word/2012/wordml" xmlns:w16cex="http://schemas.microsoft.com/office/word/2018/wordml/cex" xmlns:w16cid="http://schemas.microsoft.com/office/word/2016/wordml/cid" xmlns:w16="http://schemas.microsoft.com/office/word/2018/wordml" xmlns:w16du="http://schemas.microsoft.com/office/word/2023/wordml/word16du" xmlns:w16sdtdh="http://schemas.microsoft.com/office/word/2020/wordml/sdtdatahash" xmlns:w16sdtfl="http://schemas.microsoft.com/office/word/2024/wordml/sdtformatlock" xmlns:w16se="http://schemas.microsoft.com/office/word/2015/wordml/symex" xmlns:wpg="http://schemas.microsoft.com/office/word/2010/wordprocessingGroup" xmlns:wpi="http://schemas.microsoft.com/office/word/2010/wordprocessingInk" xmlns:wne="http://schemas.microsoft.com/office/word/2006/wordml" xmlns:wps="http://schemas.microsoft.com/office/word/2010/wordprocessingShape" mc:Ignorable="w14 w15 w16se w16cid w16 w16cex w16sdtdh w16sdtfl w16du wp14">
-  <w:p>
-    <w:pPr>
-      <w:pStyle w:val="Kopfzeile"/>
       <w:rPr>
         <w:rFonts w:ascii="Arial" w:hAnsi="Arial" w:cs="Arial"/>
         <w:color w:val="808080"/>
@@ -2187,7 +2155,7 @@
 </w:hdr>
 </file>
 
-<file path=word/header3.xml><?xml version="1.0" encoding="utf-8"?>
+<file path=word/header2.xml><?xml version="1.0" encoding="utf-8"?>
 <w:hdr xmlns:wpc="http://schemas.microsoft.com/office/word/2010/wordprocessingCanvas" xmlns:cx="http://schemas.microsoft.com/office/drawing/2014/chartex" xmlns:cx1="http://schemas.microsoft.com/office/drawing/2015/9/8/chartex" xmlns:cx2="http://schemas.microsoft.com/office/drawing/2015/10/21/chartex" xmlns:cx3="http://schemas.microsoft.com/office/drawing/2016/5/9/chartex" xmlns:cx4="http://schemas.microsoft.com/office/drawing/2016/5/10/chartex" xmlns:cx5="http://schemas.microsoft.com/office/drawing/2016/5/11/chartex" xmlns:cx6="http://schemas.microsoft.com/office/drawing/2016/5/12/chartex" xmlns:cx7="http://schemas.microsoft.com/office/drawing/2016/5/13/chartex" xmlns:cx8="http://schemas.microsoft.com/office/drawing/2016/5/14/chartex" xmlns:mc="http://schemas.openxmlformats.org/markup-compatibility/2006" xmlns:aink="http://schemas.microsoft.com/office/drawing/2016/ink" xmlns:am3d="http://schemas.microsoft.com/office/drawing/2017/model3d" xmlns:o="urn:schemas-microsoft-com:office:office" xmlns:oel="http://schemas.microsoft.com/office/2019/extlst" xmlns:r="http://schemas.openxmlformats.org/officeDocument/2006/relationships" xmlns:m="http://schemas.openxmlformats.org/officeDocument/2006/math" xmlns:v="urn:schemas-microsoft-com:vml" xmlns:wp14="http://schemas.microsoft.com/office/word/2010/wordprocessingDrawing" xmlns:wp="http://schemas.openxmlformats.org/drawingml/2006/wordprocessingDrawing" xmlns:w10="urn:schemas-microsoft-com:office:word" xmlns:w="http://schemas.openxmlformats.org/wordprocessingml/2006/main" xmlns:w14="http://schemas.microsoft.com/office/word/2010/wordml" xmlns:w15="http://schemas.microsoft.com/office/word/2012/wordml" xmlns:w16cex="http://schemas.microsoft.com/office/word/2018/wordml/cex" xmlns:w16cid="http://schemas.microsoft.com/office/word/2016/wordml/cid" xmlns:w16="http://schemas.microsoft.com/office/word/2018/wordml" xmlns:w16du="http://schemas.microsoft.com/office/word/2023/wordml/word16du" xmlns:w16sdtdh="http://schemas.microsoft.com/office/word/2020/wordml/sdtdatahash" xmlns:w16sdtfl="http://schemas.microsoft.com/office/word/2024/wordml/sdtformatlock" xmlns:w16se="http://schemas.microsoft.com/office/word/2015/wordml/symex" xmlns:wpg="http://schemas.microsoft.com/office/word/2010/wordprocessingGroup" xmlns:wpi="http://schemas.microsoft.com/office/word/2010/wordprocessingInk" xmlns:wne="http://schemas.microsoft.com/office/word/2006/wordml" xmlns:wps="http://schemas.microsoft.com/office/word/2010/wordprocessingShape" mc:Ignorable="w14 w15 w16se w16cid w16 w16cex w16sdtdh w16sdtfl w16du wp14">
   <w:p>
     <w:pPr>

</xml_diff>